<commit_message>
FIX: #261, #762, #851, #880, #910, #911, #912, #922, #928 y #931.
</commit_message>
<xml_diff>
--- a/202507_SISTRA2-VERSIONES_es.docx
+++ b/202507_SISTRA2-VERSIONES_es.docx
@@ -1,6 +1,6 @@
 
 <file path=word/document.xml><?xml version="1.0" encoding="utf-8"?>
-<w:document xmlns:wpc="http://schemas.microsoft.com/office/word/2010/wordprocessingCanvas" xmlns:cx="http://schemas.microsoft.com/office/drawing/2014/chartex" xmlns:cx1="http://schemas.microsoft.com/office/drawing/2015/9/8/chartex" xmlns:cx2="http://schemas.microsoft.com/office/drawing/2015/10/21/chartex" xmlns:cx3="http://schemas.microsoft.com/office/drawing/2016/5/9/chartex" xmlns:cx4="http://schemas.microsoft.com/office/drawing/2016/5/10/chartex" xmlns:cx5="http://schemas.microsoft.com/office/drawing/2016/5/11/chartex" xmlns:cx6="http://schemas.microsoft.com/office/drawing/2016/5/12/chartex" xmlns:cx7="http://schemas.microsoft.com/office/drawing/2016/5/13/chartex" xmlns:cx8="http://schemas.microsoft.com/office/drawing/2016/5/14/chartex" xmlns:mc="http://schemas.openxmlformats.org/markup-compatibility/2006" xmlns:aink="http://schemas.microsoft.com/office/drawing/2016/ink" xmlns:am3d="http://schemas.microsoft.com/office/drawing/2017/model3d" xmlns:o="urn:schemas-microsoft-com:office:office" xmlns:oel="http://schemas.microsoft.com/office/2019/extlst" xmlns:r="http://schemas.openxmlformats.org/officeDocument/2006/relationships" xmlns:m="http://schemas.openxmlformats.org/officeDocument/2006/math" xmlns:v="urn:schemas-microsoft-com:vml" xmlns:wp14="http://schemas.microsoft.com/office/word/2010/wordprocessingDrawing" xmlns:wp="http://schemas.openxmlformats.org/drawingml/2006/wordprocessingDrawing" xmlns:w10="urn:schemas-microsoft-com:office:word" xmlns:w="http://schemas.openxmlformats.org/wordprocessingml/2006/main" xmlns:w14="http://schemas.microsoft.com/office/word/2010/wordml" xmlns:w15="http://schemas.microsoft.com/office/word/2012/wordml" xmlns:w16cex="http://schemas.microsoft.com/office/word/2018/wordml/cex" xmlns:w16cid="http://schemas.microsoft.com/office/word/2016/wordml/cid" xmlns:w16="http://schemas.microsoft.com/office/word/2018/wordml" xmlns:w16sdtdh="http://schemas.microsoft.com/office/word/2020/wordml/sdtdatahash" xmlns:w16se="http://schemas.microsoft.com/office/word/2015/wordml/symex" xmlns:wpg="http://schemas.microsoft.com/office/word/2010/wordprocessingGroup" xmlns:wpi="http://schemas.microsoft.com/office/word/2010/wordprocessingInk" xmlns:wne="http://schemas.microsoft.com/office/word/2006/wordml" xmlns:wps="http://schemas.microsoft.com/office/word/2010/wordprocessingShape" mc:Ignorable="w14 w15 w16se w16cid w16 w16cex w16sdtdh wp14">
+<w:document xmlns:wpc="http://schemas.microsoft.com/office/word/2010/wordprocessingCanvas" xmlns:cx="http://schemas.microsoft.com/office/drawing/2014/chartex" xmlns:cx1="http://schemas.microsoft.com/office/drawing/2015/9/8/chartex" xmlns:cx2="http://schemas.microsoft.com/office/drawing/2015/10/21/chartex" xmlns:cx3="http://schemas.microsoft.com/office/drawing/2016/5/9/chartex" xmlns:cx4="http://schemas.microsoft.com/office/drawing/2016/5/10/chartex" xmlns:cx5="http://schemas.microsoft.com/office/drawing/2016/5/11/chartex" xmlns:cx6="http://schemas.microsoft.com/office/drawing/2016/5/12/chartex" xmlns:cx7="http://schemas.microsoft.com/office/drawing/2016/5/13/chartex" xmlns:cx8="http://schemas.microsoft.com/office/drawing/2016/5/14/chartex" xmlns:mc="http://schemas.openxmlformats.org/markup-compatibility/2006" xmlns:aink="http://schemas.microsoft.com/office/drawing/2016/ink" xmlns:am3d="http://schemas.microsoft.com/office/drawing/2017/model3d" xmlns:o="urn:schemas-microsoft-com:office:office" xmlns:oel="http://schemas.microsoft.com/office/2019/extlst" xmlns:r="http://schemas.openxmlformats.org/officeDocument/2006/relationships" xmlns:m="http://schemas.openxmlformats.org/officeDocument/2006/math" xmlns:v="urn:schemas-microsoft-com:vml" xmlns:wp14="http://schemas.microsoft.com/office/word/2010/wordprocessingDrawing" xmlns:wp="http://schemas.openxmlformats.org/drawingml/2006/wordprocessingDrawing" xmlns:w10="urn:schemas-microsoft-com:office:word" xmlns:w="http://schemas.openxmlformats.org/wordprocessingml/2006/main" xmlns:w14="http://schemas.microsoft.com/office/word/2010/wordml" xmlns:w15="http://schemas.microsoft.com/office/word/2012/wordml" xmlns:w16cex="http://schemas.microsoft.com/office/word/2018/wordml/cex" xmlns:w16cid="http://schemas.microsoft.com/office/word/2016/wordml/cid" xmlns:w16="http://schemas.microsoft.com/office/word/2018/wordml" xmlns:w16du="http://schemas.microsoft.com/office/word/2023/wordml/word16du" xmlns:w16sdtdh="http://schemas.microsoft.com/office/word/2020/wordml/sdtdatahash" xmlns:w16sdtfl="http://schemas.microsoft.com/office/word/2024/wordml/sdtformatlock" xmlns:w16se="http://schemas.microsoft.com/office/word/2015/wordml/symex" xmlns:wpg="http://schemas.microsoft.com/office/word/2010/wordprocessingGroup" xmlns:wpi="http://schemas.microsoft.com/office/word/2010/wordprocessingInk" xmlns:wne="http://schemas.microsoft.com/office/word/2006/wordml" xmlns:wps="http://schemas.microsoft.com/office/word/2010/wordprocessingShape" mc:Ignorable="w14 w15 w16se w16cid w16 w16cex w16sdtdh w16sdtfl w16du wp14">
   <w:background w:color="FFFFFF"/>
   <w:body>
     <w:p>
@@ -3631,25 +3631,7 @@
               <w:rPr>
                 <w:sz w:val="16"/>
               </w:rPr>
-              <w:t>Adición de la versión 1.</w:t>
-            </w:r>
-            <w:r>
-              <w:rPr>
-                <w:sz w:val="16"/>
-              </w:rPr>
-              <w:t>7</w:t>
-            </w:r>
-            <w:r>
-              <w:rPr>
-                <w:sz w:val="16"/>
-              </w:rPr>
-              <w:t>.</w:t>
-            </w:r>
-            <w:r>
-              <w:rPr>
-                <w:sz w:val="16"/>
-              </w:rPr>
-              <w:t>5</w:t>
+              <w:t>Adición de la versión 1.7.5</w:t>
             </w:r>
           </w:p>
         </w:tc>
@@ -3767,25 +3749,7 @@
               <w:rPr>
                 <w:sz w:val="16"/>
               </w:rPr>
-              <w:t>Adición de la versión 1.</w:t>
-            </w:r>
-            <w:r>
-              <w:rPr>
-                <w:sz w:val="16"/>
-              </w:rPr>
-              <w:t>8</w:t>
-            </w:r>
-            <w:r>
-              <w:rPr>
-                <w:sz w:val="16"/>
-              </w:rPr>
-              <w:t>.</w:t>
-            </w:r>
-            <w:r>
-              <w:rPr>
-                <w:sz w:val="16"/>
-              </w:rPr>
-              <w:t>0</w:t>
+              <w:t>Adición de la versión 1.8.0</w:t>
             </w:r>
           </w:p>
         </w:tc>
@@ -32029,21 +31993,7 @@
         <w:rPr>
           <w:lang w:val="en-US"/>
         </w:rPr>
-        <w:t xml:space="preserve">#582 </w:t>
-      </w:r>
-      <w:proofErr w:type="spellStart"/>
-      <w:r>
-        <w:rPr>
-          <w:lang w:val="en-US"/>
-        </w:rPr>
-        <w:t>Millora</w:t>
-      </w:r>
-      <w:proofErr w:type="spellEnd"/>
-      <w:r>
-        <w:rPr>
-          <w:lang w:val="en-US"/>
-        </w:rPr>
-        <w:t xml:space="preserve"> Ajuda </w:t>
+        <w:t xml:space="preserve">#582 Millora Ajuda </w:t>
       </w:r>
       <w:proofErr w:type="spellStart"/>
       <w:r>
@@ -34527,8 +34477,8 @@
           <w:numId w:val="2"/>
         </w:numPr>
       </w:pPr>
-      <w:bookmarkStart w:id="82" w:name="_Hlk126677327"/>
-      <w:bookmarkStart w:id="83" w:name="_Toc202722655"/>
+      <w:bookmarkStart w:id="82" w:name="_Toc202722655"/>
+      <w:bookmarkStart w:id="83" w:name="_Hlk126677327"/>
       <w:bookmarkEnd w:id="81"/>
       <w:r>
         <w:t>N</w:t>
@@ -34575,9 +34525,9 @@
       <w:r>
         <w:t>s</w:t>
       </w:r>
-      <w:bookmarkEnd w:id="83"/>
-    </w:p>
-    <w:bookmarkEnd w:id="82"/>
+      <w:bookmarkEnd w:id="82"/>
+    </w:p>
+    <w:bookmarkEnd w:id="83"/>
     <w:p/>
     <w:p>
       <w:pPr>
@@ -36909,21 +36859,7 @@
         <w:rPr>
           <w:lang w:val="en-US"/>
         </w:rPr>
-        <w:t xml:space="preserve"> de </w:t>
-      </w:r>
-      <w:proofErr w:type="spellStart"/>
-      <w:r>
-        <w:rPr>
-          <w:lang w:val="en-US"/>
-        </w:rPr>
-        <w:t>Dominis</w:t>
-      </w:r>
-      <w:proofErr w:type="spellEnd"/>
-      <w:r>
-        <w:rPr>
-          <w:lang w:val="en-US"/>
-        </w:rPr>
-        <w:t xml:space="preserve"> </w:t>
+        <w:t xml:space="preserve"> de Dominis </w:t>
       </w:r>
       <w:proofErr w:type="spellStart"/>
       <w:r>
@@ -55952,7 +55888,7 @@
           <w:color w:val="000080"/>
           <w:sz w:val="28"/>
         </w:rPr>
-        <w:t>2</w:t>
+        <w:t>28</w:t>
       </w:r>
       <w:r>
         <w:rPr>
@@ -55960,7 +55896,7 @@
           <w:color w:val="000080"/>
           <w:sz w:val="28"/>
         </w:rPr>
-        <w:t>8</w:t>
+        <w:t xml:space="preserve"> Versión 1.</w:t>
       </w:r>
       <w:r>
         <w:rPr>
@@ -55968,7 +55904,7 @@
           <w:color w:val="000080"/>
           <w:sz w:val="28"/>
         </w:rPr>
-        <w:t xml:space="preserve"> Versión 1.</w:t>
+        <w:t>7</w:t>
       </w:r>
       <w:r>
         <w:rPr>
@@ -55976,7 +55912,7 @@
           <w:color w:val="000080"/>
           <w:sz w:val="28"/>
         </w:rPr>
-        <w:t>7</w:t>
+        <w:t>.</w:t>
       </w:r>
       <w:r>
         <w:rPr>
@@ -55984,7 +55920,7 @@
           <w:color w:val="000080"/>
           <w:sz w:val="28"/>
         </w:rPr>
-        <w:t>.</w:t>
+        <w:t>5</w:t>
       </w:r>
       <w:r>
         <w:rPr>
@@ -55992,7 +55928,7 @@
           <w:color w:val="000080"/>
           <w:sz w:val="28"/>
         </w:rPr>
-        <w:t>5</w:t>
+        <w:t xml:space="preserve"> (</w:t>
       </w:r>
       <w:r>
         <w:rPr>
@@ -56000,7 +55936,7 @@
           <w:color w:val="000080"/>
           <w:sz w:val="28"/>
         </w:rPr>
-        <w:t xml:space="preserve"> (</w:t>
+        <w:t>14</w:t>
       </w:r>
       <w:r>
         <w:rPr>
@@ -56008,7 +55944,7 @@
           <w:color w:val="000080"/>
           <w:sz w:val="28"/>
         </w:rPr>
-        <w:t>14</w:t>
+        <w:t>/</w:t>
       </w:r>
       <w:r>
         <w:rPr>
@@ -56016,23 +55952,7 @@
           <w:color w:val="000080"/>
           <w:sz w:val="28"/>
         </w:rPr>
-        <w:t>/</w:t>
-      </w:r>
-      <w:r>
-        <w:rPr>
-          <w:b/>
-          <w:color w:val="000080"/>
-          <w:sz w:val="28"/>
-        </w:rPr>
-        <w:t>0</w:t>
-      </w:r>
-      <w:r>
-        <w:rPr>
-          <w:b/>
-          <w:color w:val="000080"/>
-          <w:sz w:val="28"/>
-        </w:rPr>
-        <w:t>4</w:t>
+        <w:t>04</w:t>
       </w:r>
       <w:r>
         <w:rPr>
@@ -56096,14 +56016,7 @@
           <w:color w:val="000080"/>
           <w:sz w:val="24"/>
         </w:rPr>
-        <w:t>2</w:t>
-      </w:r>
-      <w:r>
-        <w:rPr>
-          <w:color w:val="000080"/>
-          <w:sz w:val="24"/>
-        </w:rPr>
-        <w:t>8</w:t>
+        <w:t>28</w:t>
       </w:r>
       <w:r>
         <w:rPr>
@@ -56170,14 +56083,7 @@
           <w:color w:val="000080"/>
           <w:sz w:val="24"/>
         </w:rPr>
-        <w:t>2</w:t>
-      </w:r>
-      <w:r>
-        <w:rPr>
-          <w:color w:val="000080"/>
-          <w:sz w:val="24"/>
-        </w:rPr>
-        <w:t>8</w:t>
+        <w:t>28</w:t>
       </w:r>
       <w:r>
         <w:rPr>
@@ -56294,14 +56200,7 @@
           <w:color w:val="000080"/>
           <w:sz w:val="24"/>
         </w:rPr>
-        <w:t>2</w:t>
-      </w:r>
-      <w:r>
-        <w:rPr>
-          <w:color w:val="000080"/>
-          <w:sz w:val="24"/>
-        </w:rPr>
-        <w:t>8</w:t>
+        <w:t>28</w:t>
       </w:r>
       <w:r>
         <w:rPr>
@@ -56363,15 +56262,7 @@
           <w:color w:val="000080"/>
           <w:sz w:val="28"/>
         </w:rPr>
-        <w:t>2</w:t>
-      </w:r>
-      <w:r>
-        <w:rPr>
-          <w:b/>
-          <w:color w:val="000080"/>
-          <w:sz w:val="28"/>
-        </w:rPr>
-        <w:t>9</w:t>
+        <w:t>29</w:t>
       </w:r>
       <w:r>
         <w:rPr>
@@ -56515,20 +56406,13 @@
           <w:color w:val="000080"/>
           <w:sz w:val="24"/>
         </w:rPr>
-        <w:t>2</w:t>
+        <w:t>29</w:t>
       </w:r>
       <w:r>
         <w:rPr>
           <w:color w:val="000080"/>
           <w:sz w:val="24"/>
         </w:rPr>
-        <w:t>9</w:t>
-      </w:r>
-      <w:r>
-        <w:rPr>
-          <w:color w:val="000080"/>
-          <w:sz w:val="24"/>
-        </w:rPr>
         <w:t>.1. Nuevas funcionalidades y mejoras más relevantes</w:t>
       </w:r>
       <w:bookmarkEnd w:id="152"/>
@@ -57065,13 +56949,7 @@
         <w:ind w:left="360"/>
       </w:pPr>
       <w:r>
-        <w:t xml:space="preserve">Esta issue permite </w:t>
-      </w:r>
-      <w:r>
-        <w:t>buscar los trámites iniciados por funcionario habilitado en SISTRAHELP</w:t>
-      </w:r>
-      <w:r>
-        <w:t>.</w:t>
+        <w:t>Esta issue permite buscar los trámites iniciados por funcionario habilitado en SISTRAHELP.</w:t>
       </w:r>
     </w:p>
     <w:p>
@@ -57177,20 +57055,13 @@
           <w:color w:val="000080"/>
           <w:sz w:val="24"/>
         </w:rPr>
-        <w:t>2</w:t>
+        <w:t>29</w:t>
       </w:r>
       <w:r>
         <w:rPr>
           <w:color w:val="000080"/>
           <w:sz w:val="24"/>
         </w:rPr>
-        <w:t>9</w:t>
-      </w:r>
-      <w:r>
-        <w:rPr>
-          <w:color w:val="000080"/>
-          <w:sz w:val="24"/>
-        </w:rPr>
         <w:t>.2. Otras mejoras</w:t>
       </w:r>
       <w:bookmarkEnd w:id="155"/>
@@ -57397,13 +57268,7 @@
         <w:ind w:left="360"/>
       </w:pPr>
       <w:r>
-        <w:t xml:space="preserve">Con esta issue es posible ocultar o mostrar dinámicamente </w:t>
-      </w:r>
-      <w:r>
-        <w:t>componentes individuales</w:t>
-      </w:r>
-      <w:r>
-        <w:t xml:space="preserve"> del formulario, en función de las acciones de ciudadano, de forma que los situados a su derecha se desplacen para evitar el hueco en el formulario.</w:t>
+        <w:t>Con esta issue es posible ocultar o mostrar dinámicamente componentes individuales del formulario, en función de las acciones de ciudadano, de forma que los situados a su derecha se desplacen para evitar el hueco en el formulario.</w:t>
       </w:r>
     </w:p>
     <w:p>
@@ -59401,6 +59266,92 @@
           <w:lang w:eastAsia="en-US"/>
         </w:rPr>
         <w:t>Con esta issue se crea un nuevo rol para poder configurar permisos de acceso a SISTRAHELP para personal CAU, con los que pueda acceder a ciertas pantallas para ver los eventos y cuadro de mando de todas las áreas.</w:t>
+      </w:r>
+    </w:p>
+    <w:p>
+      <w:pPr>
+        <w:suppressAutoHyphens w:val="0"/>
+        <w:spacing w:before="0" w:after="0"/>
+        <w:ind w:left="360"/>
+        <w:rPr>
+          <w:rFonts w:ascii="Calibri" w:eastAsia="Calibri" w:hAnsi="Calibri" w:cs="Calibri"/>
+          <w:sz w:val="22"/>
+          <w:szCs w:val="22"/>
+          <w:lang w:eastAsia="en-US"/>
+        </w:rPr>
+      </w:pPr>
+    </w:p>
+    <w:p>
+      <w:pPr>
+        <w:numPr>
+          <w:ilvl w:val="0"/>
+          <w:numId w:val="21"/>
+        </w:numPr>
+        <w:suppressAutoHyphens w:val="0"/>
+        <w:spacing w:before="0" w:after="0"/>
+        <w:ind w:left="360"/>
+      </w:pPr>
+      <w:r>
+        <w:t xml:space="preserve">#928 </w:t>
+      </w:r>
+      <w:proofErr w:type="spellStart"/>
+      <w:r>
+        <w:t>Actualitzar</w:t>
+      </w:r>
+      <w:proofErr w:type="spellEnd"/>
+      <w:r>
+        <w:t xml:space="preserve"> </w:t>
+      </w:r>
+      <w:proofErr w:type="spellStart"/>
+      <w:r>
+        <w:t>descripció</w:t>
+      </w:r>
+      <w:proofErr w:type="spellEnd"/>
+      <w:r>
+        <w:t xml:space="preserve"> de </w:t>
+      </w:r>
+      <w:proofErr w:type="spellStart"/>
+      <w:r>
+        <w:t>propietats</w:t>
+      </w:r>
+      <w:proofErr w:type="spellEnd"/>
+      <w:r>
+        <w:t xml:space="preserve"> </w:t>
+      </w:r>
+      <w:proofErr w:type="spellStart"/>
+      <w:r>
+        <w:t>globals</w:t>
+      </w:r>
+      <w:proofErr w:type="spellEnd"/>
+      <w:r>
+        <w:t xml:space="preserve"> de purga de </w:t>
+      </w:r>
+      <w:proofErr w:type="spellStart"/>
+      <w:r>
+        <w:t>pagament</w:t>
+      </w:r>
+      <w:proofErr w:type="spellEnd"/>
+    </w:p>
+    <w:p>
+      <w:pPr>
+        <w:suppressAutoHyphens w:val="0"/>
+        <w:spacing w:before="0" w:after="0"/>
+        <w:ind w:left="360"/>
+        <w:rPr>
+          <w:rFonts w:ascii="Calibri" w:eastAsia="Calibri" w:hAnsi="Calibri" w:cs="Calibri"/>
+          <w:sz w:val="22"/>
+          <w:szCs w:val="22"/>
+          <w:lang w:eastAsia="en-US"/>
+        </w:rPr>
+      </w:pPr>
+      <w:r>
+        <w:rPr>
+          <w:rFonts w:ascii="Calibri" w:eastAsia="Calibri" w:hAnsi="Calibri" w:cs="Calibri"/>
+          <w:sz w:val="22"/>
+          <w:szCs w:val="22"/>
+          <w:lang w:eastAsia="en-US"/>
+        </w:rPr>
+        <w:t>Esta issue mejora la descripción de las propiedades globales de purga de pagos.</w:t>
       </w:r>
     </w:p>
     <w:bookmarkEnd w:id="156"/>
@@ -59448,20 +59399,13 @@
           <w:color w:val="000080"/>
           <w:sz w:val="24"/>
         </w:rPr>
-        <w:t>2</w:t>
+        <w:t>29</w:t>
       </w:r>
       <w:r>
         <w:rPr>
           <w:color w:val="000080"/>
           <w:sz w:val="24"/>
         </w:rPr>
-        <w:t>9</w:t>
-      </w:r>
-      <w:r>
-        <w:rPr>
-          <w:color w:val="000080"/>
-          <w:sz w:val="24"/>
-        </w:rPr>
         <w:t>.3. Errores resueltos</w:t>
       </w:r>
       <w:bookmarkEnd w:id="157"/>
@@ -59779,7 +59723,6 @@
         <w:ind w:left="360"/>
       </w:pPr>
       <w:r>
-        <w:lastRenderedPageBreak/>
         <w:t>#</w:t>
       </w:r>
       <w:r>
@@ -60705,6 +60648,46 @@
         <w:suppressAutoHyphens w:val="0"/>
         <w:spacing w:before="0" w:after="0"/>
         <w:ind w:left="360"/>
+        <w:rPr>
+          <w:lang w:val="pt-PT"/>
+        </w:rPr>
+      </w:pPr>
+      <w:r>
+        <w:rPr>
+          <w:lang w:val="pt-PT"/>
+        </w:rPr>
+        <w:t>#922 Evitar creació de nou pagament sense haver descartat des de S2</w:t>
+      </w:r>
+    </w:p>
+    <w:p>
+      <w:pPr>
+        <w:suppressAutoHyphens w:val="0"/>
+        <w:spacing w:before="0" w:after="0"/>
+        <w:ind w:left="360"/>
+      </w:pPr>
+      <w:r>
+        <w:t>Esta issue asegura que sólo</w:t>
+      </w:r>
+      <w:r>
+        <w:t xml:space="preserve"> se crearán nuevos pagos si no existe ninguno previo o se ha cancelado expresamente por el ciudadano el actual.</w:t>
+      </w:r>
+    </w:p>
+    <w:p>
+      <w:pPr>
+        <w:suppressAutoHyphens w:val="0"/>
+        <w:spacing w:before="0" w:after="0"/>
+        <w:ind w:left="360"/>
+      </w:pPr>
+    </w:p>
+    <w:p>
+      <w:pPr>
+        <w:numPr>
+          <w:ilvl w:val="0"/>
+          <w:numId w:val="21"/>
+        </w:numPr>
+        <w:suppressAutoHyphens w:val="0"/>
+        <w:spacing w:before="0" w:after="0"/>
+        <w:ind w:left="360"/>
       </w:pPr>
       <w:r>
         <w:t>#</w:t>
@@ -60750,15 +60733,56 @@
     </w:p>
     <w:p>
       <w:pPr>
-        <w:suppressAutoHyphens w:val="0"/>
-        <w:spacing w:before="0" w:after="0"/>
-      </w:pPr>
-    </w:p>
-    <w:p>
-      <w:pPr>
-        <w:suppressAutoHyphens w:val="0"/>
-        <w:spacing w:before="0" w:after="0"/>
-      </w:pPr>
+        <w:numPr>
+          <w:ilvl w:val="0"/>
+          <w:numId w:val="21"/>
+        </w:numPr>
+        <w:suppressAutoHyphens w:val="0"/>
+        <w:spacing w:before="0" w:after="0"/>
+        <w:ind w:left="360"/>
+      </w:pPr>
+      <w:r>
+        <w:t xml:space="preserve">#931 Evitar </w:t>
+      </w:r>
+      <w:proofErr w:type="spellStart"/>
+      <w:r>
+        <w:t>problemes</w:t>
+      </w:r>
+      <w:proofErr w:type="spellEnd"/>
+      <w:r>
+        <w:t xml:space="preserve"> </w:t>
+      </w:r>
+      <w:proofErr w:type="spellStart"/>
+      <w:r>
+        <w:t>amb</w:t>
+      </w:r>
+      <w:proofErr w:type="spellEnd"/>
+      <w:r>
+        <w:t xml:space="preserve"> la purga de </w:t>
+      </w:r>
+      <w:proofErr w:type="spellStart"/>
+      <w:r>
+        <w:t>fitxers</w:t>
+      </w:r>
+      <w:proofErr w:type="spellEnd"/>
+      <w:r>
+        <w:t xml:space="preserve"> </w:t>
+      </w:r>
+      <w:proofErr w:type="spellStart"/>
+      <w:r>
+        <w:t>orfes</w:t>
+      </w:r>
+      <w:proofErr w:type="spellEnd"/>
+    </w:p>
+    <w:p>
+      <w:pPr>
+        <w:suppressAutoHyphens w:val="0"/>
+        <w:spacing w:before="0" w:after="0"/>
+        <w:ind w:left="360"/>
+      </w:pPr>
+      <w:r>
+        <w:t>Esta issue resuelve un problema en el flujo de tramitación que provocaba que no se pudiesen purgar correctamente los ficheros huérfanos.</w:t>
+      </w:r>
     </w:p>
     <w:p>
       <w:pPr>
@@ -60790,7 +60814,7 @@
 </file>
 
 <file path=word/endnotes.xml><?xml version="1.0" encoding="utf-8"?>
-<w:endnotes xmlns:wpc="http://schemas.microsoft.com/office/word/2010/wordprocessingCanvas" xmlns:cx="http://schemas.microsoft.com/office/drawing/2014/chartex" xmlns:cx1="http://schemas.microsoft.com/office/drawing/2015/9/8/chartex" xmlns:cx2="http://schemas.microsoft.com/office/drawing/2015/10/21/chartex" xmlns:cx3="http://schemas.microsoft.com/office/drawing/2016/5/9/chartex" xmlns:cx4="http://schemas.microsoft.com/office/drawing/2016/5/10/chartex" xmlns:cx5="http://schemas.microsoft.com/office/drawing/2016/5/11/chartex" xmlns:cx6="http://schemas.microsoft.com/office/drawing/2016/5/12/chartex" xmlns:cx7="http://schemas.microsoft.com/office/drawing/2016/5/13/chartex" xmlns:cx8="http://schemas.microsoft.com/office/drawing/2016/5/14/chartex" xmlns:mc="http://schemas.openxmlformats.org/markup-compatibility/2006" xmlns:aink="http://schemas.microsoft.com/office/drawing/2016/ink" xmlns:am3d="http://schemas.microsoft.com/office/drawing/2017/model3d" xmlns:o="urn:schemas-microsoft-com:office:office" xmlns:oel="http://schemas.microsoft.com/office/2019/extlst" xmlns:r="http://schemas.openxmlformats.org/officeDocument/2006/relationships" xmlns:m="http://schemas.openxmlformats.org/officeDocument/2006/math" xmlns:v="urn:schemas-microsoft-com:vml" xmlns:wp14="http://schemas.microsoft.com/office/word/2010/wordprocessingDrawing" xmlns:wp="http://schemas.openxmlformats.org/drawingml/2006/wordprocessingDrawing" xmlns:w10="urn:schemas-microsoft-com:office:word" xmlns:w="http://schemas.openxmlformats.org/wordprocessingml/2006/main" xmlns:w14="http://schemas.microsoft.com/office/word/2010/wordml" xmlns:w15="http://schemas.microsoft.com/office/word/2012/wordml" xmlns:w16cex="http://schemas.microsoft.com/office/word/2018/wordml/cex" xmlns:w16cid="http://schemas.microsoft.com/office/word/2016/wordml/cid" xmlns:w16="http://schemas.microsoft.com/office/word/2018/wordml" xmlns:w16sdtdh="http://schemas.microsoft.com/office/word/2020/wordml/sdtdatahash" xmlns:w16se="http://schemas.microsoft.com/office/word/2015/wordml/symex" xmlns:wpg="http://schemas.microsoft.com/office/word/2010/wordprocessingGroup" xmlns:wpi="http://schemas.microsoft.com/office/word/2010/wordprocessingInk" xmlns:wne="http://schemas.microsoft.com/office/word/2006/wordml" xmlns:wps="http://schemas.microsoft.com/office/word/2010/wordprocessingShape" mc:Ignorable="w14 w15 w16se w16cid w16 w16cex w16sdtdh wp14">
+<w:endnotes xmlns:wpc="http://schemas.microsoft.com/office/word/2010/wordprocessingCanvas" xmlns:cx="http://schemas.microsoft.com/office/drawing/2014/chartex" xmlns:cx1="http://schemas.microsoft.com/office/drawing/2015/9/8/chartex" xmlns:cx2="http://schemas.microsoft.com/office/drawing/2015/10/21/chartex" xmlns:cx3="http://schemas.microsoft.com/office/drawing/2016/5/9/chartex" xmlns:cx4="http://schemas.microsoft.com/office/drawing/2016/5/10/chartex" xmlns:cx5="http://schemas.microsoft.com/office/drawing/2016/5/11/chartex" xmlns:cx6="http://schemas.microsoft.com/office/drawing/2016/5/12/chartex" xmlns:cx7="http://schemas.microsoft.com/office/drawing/2016/5/13/chartex" xmlns:cx8="http://schemas.microsoft.com/office/drawing/2016/5/14/chartex" xmlns:mc="http://schemas.openxmlformats.org/markup-compatibility/2006" xmlns:aink="http://schemas.microsoft.com/office/drawing/2016/ink" xmlns:am3d="http://schemas.microsoft.com/office/drawing/2017/model3d" xmlns:o="urn:schemas-microsoft-com:office:office" xmlns:oel="http://schemas.microsoft.com/office/2019/extlst" xmlns:r="http://schemas.openxmlformats.org/officeDocument/2006/relationships" xmlns:m="http://schemas.openxmlformats.org/officeDocument/2006/math" xmlns:v="urn:schemas-microsoft-com:vml" xmlns:wp14="http://schemas.microsoft.com/office/word/2010/wordprocessingDrawing" xmlns:wp="http://schemas.openxmlformats.org/drawingml/2006/wordprocessingDrawing" xmlns:w10="urn:schemas-microsoft-com:office:word" xmlns:w="http://schemas.openxmlformats.org/wordprocessingml/2006/main" xmlns:w14="http://schemas.microsoft.com/office/word/2010/wordml" xmlns:w15="http://schemas.microsoft.com/office/word/2012/wordml" xmlns:w16cex="http://schemas.microsoft.com/office/word/2018/wordml/cex" xmlns:w16cid="http://schemas.microsoft.com/office/word/2016/wordml/cid" xmlns:w16="http://schemas.microsoft.com/office/word/2018/wordml" xmlns:w16du="http://schemas.microsoft.com/office/word/2023/wordml/word16du" xmlns:w16sdtdh="http://schemas.microsoft.com/office/word/2020/wordml/sdtdatahash" xmlns:w16sdtfl="http://schemas.microsoft.com/office/word/2024/wordml/sdtformatlock" xmlns:w16se="http://schemas.microsoft.com/office/word/2015/wordml/symex" xmlns:wpg="http://schemas.microsoft.com/office/word/2010/wordprocessingGroup" xmlns:wpi="http://schemas.microsoft.com/office/word/2010/wordprocessingInk" xmlns:wne="http://schemas.microsoft.com/office/word/2006/wordml" xmlns:wps="http://schemas.microsoft.com/office/word/2010/wordprocessingShape" mc:Ignorable="w14 w15 w16se w16cid w16 w16cex w16sdtdh w16sdtfl w16du wp14">
   <w:endnote w:type="separator" w:id="-1">
     <w:p>
       <w:pPr>
@@ -60815,7 +60839,7 @@
 </file>
 
 <file path=word/footer1.xml><?xml version="1.0" encoding="utf-8"?>
-<w:ftr xmlns:wpc="http://schemas.microsoft.com/office/word/2010/wordprocessingCanvas" xmlns:cx="http://schemas.microsoft.com/office/drawing/2014/chartex" xmlns:cx1="http://schemas.microsoft.com/office/drawing/2015/9/8/chartex" xmlns:cx2="http://schemas.microsoft.com/office/drawing/2015/10/21/chartex" xmlns:cx3="http://schemas.microsoft.com/office/drawing/2016/5/9/chartex" xmlns:cx4="http://schemas.microsoft.com/office/drawing/2016/5/10/chartex" xmlns:cx5="http://schemas.microsoft.com/office/drawing/2016/5/11/chartex" xmlns:cx6="http://schemas.microsoft.com/office/drawing/2016/5/12/chartex" xmlns:cx7="http://schemas.microsoft.com/office/drawing/2016/5/13/chartex" xmlns:cx8="http://schemas.microsoft.com/office/drawing/2016/5/14/chartex" xmlns:mc="http://schemas.openxmlformats.org/markup-compatibility/2006" xmlns:aink="http://schemas.microsoft.com/office/drawing/2016/ink" xmlns:am3d="http://schemas.microsoft.com/office/drawing/2017/model3d" xmlns:o="urn:schemas-microsoft-com:office:office" xmlns:oel="http://schemas.microsoft.com/office/2019/extlst" xmlns:r="http://schemas.openxmlformats.org/officeDocument/2006/relationships" xmlns:m="http://schemas.openxmlformats.org/officeDocument/2006/math" xmlns:v="urn:schemas-microsoft-com:vml" xmlns:wp14="http://schemas.microsoft.com/office/word/2010/wordprocessingDrawing" xmlns:wp="http://schemas.openxmlformats.org/drawingml/2006/wordprocessingDrawing" xmlns:w10="urn:schemas-microsoft-com:office:word" xmlns:w="http://schemas.openxmlformats.org/wordprocessingml/2006/main" xmlns:w14="http://schemas.microsoft.com/office/word/2010/wordml" xmlns:w15="http://schemas.microsoft.com/office/word/2012/wordml" xmlns:w16cex="http://schemas.microsoft.com/office/word/2018/wordml/cex" xmlns:w16cid="http://schemas.microsoft.com/office/word/2016/wordml/cid" xmlns:w16="http://schemas.microsoft.com/office/word/2018/wordml" xmlns:w16sdtdh="http://schemas.microsoft.com/office/word/2020/wordml/sdtdatahash" xmlns:w16se="http://schemas.microsoft.com/office/word/2015/wordml/symex" xmlns:wpg="http://schemas.microsoft.com/office/word/2010/wordprocessingGroup" xmlns:wpi="http://schemas.microsoft.com/office/word/2010/wordprocessingInk" xmlns:wne="http://schemas.microsoft.com/office/word/2006/wordml" xmlns:wps="http://schemas.microsoft.com/office/word/2010/wordprocessingShape" mc:Ignorable="w14 w15 w16se w16cid w16 w16cex w16sdtdh wp14">
+<w:ftr xmlns:wpc="http://schemas.microsoft.com/office/word/2010/wordprocessingCanvas" xmlns:cx="http://schemas.microsoft.com/office/drawing/2014/chartex" xmlns:cx1="http://schemas.microsoft.com/office/drawing/2015/9/8/chartex" xmlns:cx2="http://schemas.microsoft.com/office/drawing/2015/10/21/chartex" xmlns:cx3="http://schemas.microsoft.com/office/drawing/2016/5/9/chartex" xmlns:cx4="http://schemas.microsoft.com/office/drawing/2016/5/10/chartex" xmlns:cx5="http://schemas.microsoft.com/office/drawing/2016/5/11/chartex" xmlns:cx6="http://schemas.microsoft.com/office/drawing/2016/5/12/chartex" xmlns:cx7="http://schemas.microsoft.com/office/drawing/2016/5/13/chartex" xmlns:cx8="http://schemas.microsoft.com/office/drawing/2016/5/14/chartex" xmlns:mc="http://schemas.openxmlformats.org/markup-compatibility/2006" xmlns:aink="http://schemas.microsoft.com/office/drawing/2016/ink" xmlns:am3d="http://schemas.microsoft.com/office/drawing/2017/model3d" xmlns:o="urn:schemas-microsoft-com:office:office" xmlns:oel="http://schemas.microsoft.com/office/2019/extlst" xmlns:r="http://schemas.openxmlformats.org/officeDocument/2006/relationships" xmlns:m="http://schemas.openxmlformats.org/officeDocument/2006/math" xmlns:v="urn:schemas-microsoft-com:vml" xmlns:wp14="http://schemas.microsoft.com/office/word/2010/wordprocessingDrawing" xmlns:wp="http://schemas.openxmlformats.org/drawingml/2006/wordprocessingDrawing" xmlns:w10="urn:schemas-microsoft-com:office:word" xmlns:w="http://schemas.openxmlformats.org/wordprocessingml/2006/main" xmlns:w14="http://schemas.microsoft.com/office/word/2010/wordml" xmlns:w15="http://schemas.microsoft.com/office/word/2012/wordml" xmlns:w16cex="http://schemas.microsoft.com/office/word/2018/wordml/cex" xmlns:w16cid="http://schemas.microsoft.com/office/word/2016/wordml/cid" xmlns:w16="http://schemas.microsoft.com/office/word/2018/wordml" xmlns:w16du="http://schemas.microsoft.com/office/word/2023/wordml/word16du" xmlns:w16sdtdh="http://schemas.microsoft.com/office/word/2020/wordml/sdtdatahash" xmlns:w16sdtfl="http://schemas.microsoft.com/office/word/2024/wordml/sdtformatlock" xmlns:w16se="http://schemas.microsoft.com/office/word/2015/wordml/symex" xmlns:wpg="http://schemas.microsoft.com/office/word/2010/wordprocessingGroup" xmlns:wpi="http://schemas.microsoft.com/office/word/2010/wordprocessingInk" xmlns:wne="http://schemas.microsoft.com/office/word/2006/wordml" xmlns:wps="http://schemas.microsoft.com/office/word/2010/wordprocessingShape" mc:Ignorable="w14 w15 w16se w16cid w16 w16cex w16sdtdh w16sdtfl w16du wp14">
   <w:p>
     <w:pPr>
       <w:pStyle w:val="Piedepgina"/>
@@ -60984,7 +61008,7 @@
 </file>
 
 <file path=word/footer2.xml><?xml version="1.0" encoding="utf-8"?>
-<w:ftr xmlns:wpc="http://schemas.microsoft.com/office/word/2010/wordprocessingCanvas" xmlns:cx="http://schemas.microsoft.com/office/drawing/2014/chartex" xmlns:cx1="http://schemas.microsoft.com/office/drawing/2015/9/8/chartex" xmlns:cx2="http://schemas.microsoft.com/office/drawing/2015/10/21/chartex" xmlns:cx3="http://schemas.microsoft.com/office/drawing/2016/5/9/chartex" xmlns:cx4="http://schemas.microsoft.com/office/drawing/2016/5/10/chartex" xmlns:cx5="http://schemas.microsoft.com/office/drawing/2016/5/11/chartex" xmlns:cx6="http://schemas.microsoft.com/office/drawing/2016/5/12/chartex" xmlns:cx7="http://schemas.microsoft.com/office/drawing/2016/5/13/chartex" xmlns:cx8="http://schemas.microsoft.com/office/drawing/2016/5/14/chartex" xmlns:mc="http://schemas.openxmlformats.org/markup-compatibility/2006" xmlns:aink="http://schemas.microsoft.com/office/drawing/2016/ink" xmlns:am3d="http://schemas.microsoft.com/office/drawing/2017/model3d" xmlns:o="urn:schemas-microsoft-com:office:office" xmlns:oel="http://schemas.microsoft.com/office/2019/extlst" xmlns:r="http://schemas.openxmlformats.org/officeDocument/2006/relationships" xmlns:m="http://schemas.openxmlformats.org/officeDocument/2006/math" xmlns:v="urn:schemas-microsoft-com:vml" xmlns:wp14="http://schemas.microsoft.com/office/word/2010/wordprocessingDrawing" xmlns:wp="http://schemas.openxmlformats.org/drawingml/2006/wordprocessingDrawing" xmlns:w10="urn:schemas-microsoft-com:office:word" xmlns:w="http://schemas.openxmlformats.org/wordprocessingml/2006/main" xmlns:w14="http://schemas.microsoft.com/office/word/2010/wordml" xmlns:w15="http://schemas.microsoft.com/office/word/2012/wordml" xmlns:w16cex="http://schemas.microsoft.com/office/word/2018/wordml/cex" xmlns:w16cid="http://schemas.microsoft.com/office/word/2016/wordml/cid" xmlns:w16="http://schemas.microsoft.com/office/word/2018/wordml" xmlns:w16sdtdh="http://schemas.microsoft.com/office/word/2020/wordml/sdtdatahash" xmlns:w16se="http://schemas.microsoft.com/office/word/2015/wordml/symex" xmlns:wpg="http://schemas.microsoft.com/office/word/2010/wordprocessingGroup" xmlns:wpi="http://schemas.microsoft.com/office/word/2010/wordprocessingInk" xmlns:wne="http://schemas.microsoft.com/office/word/2006/wordml" xmlns:wps="http://schemas.microsoft.com/office/word/2010/wordprocessingShape" mc:Ignorable="w14 w15 w16se w16cid w16 w16cex w16sdtdh wp14">
+<w:ftr xmlns:wpc="http://schemas.microsoft.com/office/word/2010/wordprocessingCanvas" xmlns:cx="http://schemas.microsoft.com/office/drawing/2014/chartex" xmlns:cx1="http://schemas.microsoft.com/office/drawing/2015/9/8/chartex" xmlns:cx2="http://schemas.microsoft.com/office/drawing/2015/10/21/chartex" xmlns:cx3="http://schemas.microsoft.com/office/drawing/2016/5/9/chartex" xmlns:cx4="http://schemas.microsoft.com/office/drawing/2016/5/10/chartex" xmlns:cx5="http://schemas.microsoft.com/office/drawing/2016/5/11/chartex" xmlns:cx6="http://schemas.microsoft.com/office/drawing/2016/5/12/chartex" xmlns:cx7="http://schemas.microsoft.com/office/drawing/2016/5/13/chartex" xmlns:cx8="http://schemas.microsoft.com/office/drawing/2016/5/14/chartex" xmlns:mc="http://schemas.openxmlformats.org/markup-compatibility/2006" xmlns:aink="http://schemas.microsoft.com/office/drawing/2016/ink" xmlns:am3d="http://schemas.microsoft.com/office/drawing/2017/model3d" xmlns:o="urn:schemas-microsoft-com:office:office" xmlns:oel="http://schemas.microsoft.com/office/2019/extlst" xmlns:r="http://schemas.openxmlformats.org/officeDocument/2006/relationships" xmlns:m="http://schemas.openxmlformats.org/officeDocument/2006/math" xmlns:v="urn:schemas-microsoft-com:vml" xmlns:wp14="http://schemas.microsoft.com/office/word/2010/wordprocessingDrawing" xmlns:wp="http://schemas.openxmlformats.org/drawingml/2006/wordprocessingDrawing" xmlns:w10="urn:schemas-microsoft-com:office:word" xmlns:w="http://schemas.openxmlformats.org/wordprocessingml/2006/main" xmlns:w14="http://schemas.microsoft.com/office/word/2010/wordml" xmlns:w15="http://schemas.microsoft.com/office/word/2012/wordml" xmlns:w16cex="http://schemas.microsoft.com/office/word/2018/wordml/cex" xmlns:w16cid="http://schemas.microsoft.com/office/word/2016/wordml/cid" xmlns:w16="http://schemas.microsoft.com/office/word/2018/wordml" xmlns:w16du="http://schemas.microsoft.com/office/word/2023/wordml/word16du" xmlns:w16sdtdh="http://schemas.microsoft.com/office/word/2020/wordml/sdtdatahash" xmlns:w16sdtfl="http://schemas.microsoft.com/office/word/2024/wordml/sdtformatlock" xmlns:w16se="http://schemas.microsoft.com/office/word/2015/wordml/symex" xmlns:wpg="http://schemas.microsoft.com/office/word/2010/wordprocessingGroup" xmlns:wpi="http://schemas.microsoft.com/office/word/2010/wordprocessingInk" xmlns:wne="http://schemas.microsoft.com/office/word/2006/wordml" xmlns:wps="http://schemas.microsoft.com/office/word/2010/wordprocessingShape" mc:Ignorable="w14 w15 w16se w16cid w16 w16cex w16sdtdh w16sdtfl w16du wp14">
   <w:p>
     <w:pPr>
       <w:pStyle w:val="Piedepgina"/>
@@ -61118,7 +61142,7 @@
 </file>
 
 <file path=word/footnotes.xml><?xml version="1.0" encoding="utf-8"?>
-<w:footnotes xmlns:wpc="http://schemas.microsoft.com/office/word/2010/wordprocessingCanvas" xmlns:cx="http://schemas.microsoft.com/office/drawing/2014/chartex" xmlns:cx1="http://schemas.microsoft.com/office/drawing/2015/9/8/chartex" xmlns:cx2="http://schemas.microsoft.com/office/drawing/2015/10/21/chartex" xmlns:cx3="http://schemas.microsoft.com/office/drawing/2016/5/9/chartex" xmlns:cx4="http://schemas.microsoft.com/office/drawing/2016/5/10/chartex" xmlns:cx5="http://schemas.microsoft.com/office/drawing/2016/5/11/chartex" xmlns:cx6="http://schemas.microsoft.com/office/drawing/2016/5/12/chartex" xmlns:cx7="http://schemas.microsoft.com/office/drawing/2016/5/13/chartex" xmlns:cx8="http://schemas.microsoft.com/office/drawing/2016/5/14/chartex" xmlns:mc="http://schemas.openxmlformats.org/markup-compatibility/2006" xmlns:aink="http://schemas.microsoft.com/office/drawing/2016/ink" xmlns:am3d="http://schemas.microsoft.com/office/drawing/2017/model3d" xmlns:o="urn:schemas-microsoft-com:office:office" xmlns:oel="http://schemas.microsoft.com/office/2019/extlst" xmlns:r="http://schemas.openxmlformats.org/officeDocument/2006/relationships" xmlns:m="http://schemas.openxmlformats.org/officeDocument/2006/math" xmlns:v="urn:schemas-microsoft-com:vml" xmlns:wp14="http://schemas.microsoft.com/office/word/2010/wordprocessingDrawing" xmlns:wp="http://schemas.openxmlformats.org/drawingml/2006/wordprocessingDrawing" xmlns:w10="urn:schemas-microsoft-com:office:word" xmlns:w="http://schemas.openxmlformats.org/wordprocessingml/2006/main" xmlns:w14="http://schemas.microsoft.com/office/word/2010/wordml" xmlns:w15="http://schemas.microsoft.com/office/word/2012/wordml" xmlns:w16cex="http://schemas.microsoft.com/office/word/2018/wordml/cex" xmlns:w16cid="http://schemas.microsoft.com/office/word/2016/wordml/cid" xmlns:w16="http://schemas.microsoft.com/office/word/2018/wordml" xmlns:w16sdtdh="http://schemas.microsoft.com/office/word/2020/wordml/sdtdatahash" xmlns:w16se="http://schemas.microsoft.com/office/word/2015/wordml/symex" xmlns:wpg="http://schemas.microsoft.com/office/word/2010/wordprocessingGroup" xmlns:wpi="http://schemas.microsoft.com/office/word/2010/wordprocessingInk" xmlns:wne="http://schemas.microsoft.com/office/word/2006/wordml" xmlns:wps="http://schemas.microsoft.com/office/word/2010/wordprocessingShape" mc:Ignorable="w14 w15 w16se w16cid w16 w16cex w16sdtdh wp14">
+<w:footnotes xmlns:wpc="http://schemas.microsoft.com/office/word/2010/wordprocessingCanvas" xmlns:cx="http://schemas.microsoft.com/office/drawing/2014/chartex" xmlns:cx1="http://schemas.microsoft.com/office/drawing/2015/9/8/chartex" xmlns:cx2="http://schemas.microsoft.com/office/drawing/2015/10/21/chartex" xmlns:cx3="http://schemas.microsoft.com/office/drawing/2016/5/9/chartex" xmlns:cx4="http://schemas.microsoft.com/office/drawing/2016/5/10/chartex" xmlns:cx5="http://schemas.microsoft.com/office/drawing/2016/5/11/chartex" xmlns:cx6="http://schemas.microsoft.com/office/drawing/2016/5/12/chartex" xmlns:cx7="http://schemas.microsoft.com/office/drawing/2016/5/13/chartex" xmlns:cx8="http://schemas.microsoft.com/office/drawing/2016/5/14/chartex" xmlns:mc="http://schemas.openxmlformats.org/markup-compatibility/2006" xmlns:aink="http://schemas.microsoft.com/office/drawing/2016/ink" xmlns:am3d="http://schemas.microsoft.com/office/drawing/2017/model3d" xmlns:o="urn:schemas-microsoft-com:office:office" xmlns:oel="http://schemas.microsoft.com/office/2019/extlst" xmlns:r="http://schemas.openxmlformats.org/officeDocument/2006/relationships" xmlns:m="http://schemas.openxmlformats.org/officeDocument/2006/math" xmlns:v="urn:schemas-microsoft-com:vml" xmlns:wp14="http://schemas.microsoft.com/office/word/2010/wordprocessingDrawing" xmlns:wp="http://schemas.openxmlformats.org/drawingml/2006/wordprocessingDrawing" xmlns:w10="urn:schemas-microsoft-com:office:word" xmlns:w="http://schemas.openxmlformats.org/wordprocessingml/2006/main" xmlns:w14="http://schemas.microsoft.com/office/word/2010/wordml" xmlns:w15="http://schemas.microsoft.com/office/word/2012/wordml" xmlns:w16cex="http://schemas.microsoft.com/office/word/2018/wordml/cex" xmlns:w16cid="http://schemas.microsoft.com/office/word/2016/wordml/cid" xmlns:w16="http://schemas.microsoft.com/office/word/2018/wordml" xmlns:w16du="http://schemas.microsoft.com/office/word/2023/wordml/word16du" xmlns:w16sdtdh="http://schemas.microsoft.com/office/word/2020/wordml/sdtdatahash" xmlns:w16sdtfl="http://schemas.microsoft.com/office/word/2024/wordml/sdtformatlock" xmlns:w16se="http://schemas.microsoft.com/office/word/2015/wordml/symex" xmlns:wpg="http://schemas.microsoft.com/office/word/2010/wordprocessingGroup" xmlns:wpi="http://schemas.microsoft.com/office/word/2010/wordprocessingInk" xmlns:wne="http://schemas.microsoft.com/office/word/2006/wordml" xmlns:wps="http://schemas.microsoft.com/office/word/2010/wordprocessingShape" mc:Ignorable="w14 w15 w16se w16cid w16 w16cex w16sdtdh w16sdtfl w16du wp14">
   <w:footnote w:type="separator" w:id="-1">
     <w:p>
       <w:pPr>
@@ -61143,7 +61167,7 @@
 </file>
 
 <file path=word/header1.xml><?xml version="1.0" encoding="utf-8"?>
-<w:hdr xmlns:wpc="http://schemas.microsoft.com/office/word/2010/wordprocessingCanvas" xmlns:cx="http://schemas.microsoft.com/office/drawing/2014/chartex" xmlns:cx1="http://schemas.microsoft.com/office/drawing/2015/9/8/chartex" xmlns:cx2="http://schemas.microsoft.com/office/drawing/2015/10/21/chartex" xmlns:cx3="http://schemas.microsoft.com/office/drawing/2016/5/9/chartex" xmlns:cx4="http://schemas.microsoft.com/office/drawing/2016/5/10/chartex" xmlns:cx5="http://schemas.microsoft.com/office/drawing/2016/5/11/chartex" xmlns:cx6="http://schemas.microsoft.com/office/drawing/2016/5/12/chartex" xmlns:cx7="http://schemas.microsoft.com/office/drawing/2016/5/13/chartex" xmlns:cx8="http://schemas.microsoft.com/office/drawing/2016/5/14/chartex" xmlns:mc="http://schemas.openxmlformats.org/markup-compatibility/2006" xmlns:aink="http://schemas.microsoft.com/office/drawing/2016/ink" xmlns:am3d="http://schemas.microsoft.com/office/drawing/2017/model3d" xmlns:o="urn:schemas-microsoft-com:office:office" xmlns:oel="http://schemas.microsoft.com/office/2019/extlst" xmlns:r="http://schemas.openxmlformats.org/officeDocument/2006/relationships" xmlns:m="http://schemas.openxmlformats.org/officeDocument/2006/math" xmlns:v="urn:schemas-microsoft-com:vml" xmlns:wp14="http://schemas.microsoft.com/office/word/2010/wordprocessingDrawing" xmlns:wp="http://schemas.openxmlformats.org/drawingml/2006/wordprocessingDrawing" xmlns:w10="urn:schemas-microsoft-com:office:word" xmlns:w="http://schemas.openxmlformats.org/wordprocessingml/2006/main" xmlns:w14="http://schemas.microsoft.com/office/word/2010/wordml" xmlns:w15="http://schemas.microsoft.com/office/word/2012/wordml" xmlns:w16cex="http://schemas.microsoft.com/office/word/2018/wordml/cex" xmlns:w16cid="http://schemas.microsoft.com/office/word/2016/wordml/cid" xmlns:w16="http://schemas.microsoft.com/office/word/2018/wordml" xmlns:w16sdtdh="http://schemas.microsoft.com/office/word/2020/wordml/sdtdatahash" xmlns:w16se="http://schemas.microsoft.com/office/word/2015/wordml/symex" xmlns:wpg="http://schemas.microsoft.com/office/word/2010/wordprocessingGroup" xmlns:wpi="http://schemas.microsoft.com/office/word/2010/wordprocessingInk" xmlns:wne="http://schemas.microsoft.com/office/word/2006/wordml" xmlns:wps="http://schemas.microsoft.com/office/word/2010/wordprocessingShape" mc:Ignorable="w14 w15 w16se w16cid w16 w16cex w16sdtdh wp14">
+<w:hdr xmlns:wpc="http://schemas.microsoft.com/office/word/2010/wordprocessingCanvas" xmlns:cx="http://schemas.microsoft.com/office/drawing/2014/chartex" xmlns:cx1="http://schemas.microsoft.com/office/drawing/2015/9/8/chartex" xmlns:cx2="http://schemas.microsoft.com/office/drawing/2015/10/21/chartex" xmlns:cx3="http://schemas.microsoft.com/office/drawing/2016/5/9/chartex" xmlns:cx4="http://schemas.microsoft.com/office/drawing/2016/5/10/chartex" xmlns:cx5="http://schemas.microsoft.com/office/drawing/2016/5/11/chartex" xmlns:cx6="http://schemas.microsoft.com/office/drawing/2016/5/12/chartex" xmlns:cx7="http://schemas.microsoft.com/office/drawing/2016/5/13/chartex" xmlns:cx8="http://schemas.microsoft.com/office/drawing/2016/5/14/chartex" xmlns:mc="http://schemas.openxmlformats.org/markup-compatibility/2006" xmlns:aink="http://schemas.microsoft.com/office/drawing/2016/ink" xmlns:am3d="http://schemas.microsoft.com/office/drawing/2017/model3d" xmlns:o="urn:schemas-microsoft-com:office:office" xmlns:oel="http://schemas.microsoft.com/office/2019/extlst" xmlns:r="http://schemas.openxmlformats.org/officeDocument/2006/relationships" xmlns:m="http://schemas.openxmlformats.org/officeDocument/2006/math" xmlns:v="urn:schemas-microsoft-com:vml" xmlns:wp14="http://schemas.microsoft.com/office/word/2010/wordprocessingDrawing" xmlns:wp="http://schemas.openxmlformats.org/drawingml/2006/wordprocessingDrawing" xmlns:w10="urn:schemas-microsoft-com:office:word" xmlns:w="http://schemas.openxmlformats.org/wordprocessingml/2006/main" xmlns:w14="http://schemas.microsoft.com/office/word/2010/wordml" xmlns:w15="http://schemas.microsoft.com/office/word/2012/wordml" xmlns:w16cex="http://schemas.microsoft.com/office/word/2018/wordml/cex" xmlns:w16cid="http://schemas.microsoft.com/office/word/2016/wordml/cid" xmlns:w16="http://schemas.microsoft.com/office/word/2018/wordml" xmlns:w16du="http://schemas.microsoft.com/office/word/2023/wordml/word16du" xmlns:w16sdtdh="http://schemas.microsoft.com/office/word/2020/wordml/sdtdatahash" xmlns:w16sdtfl="http://schemas.microsoft.com/office/word/2024/wordml/sdtformatlock" xmlns:w16se="http://schemas.microsoft.com/office/word/2015/wordml/symex" xmlns:wpg="http://schemas.microsoft.com/office/word/2010/wordprocessingGroup" xmlns:wpi="http://schemas.microsoft.com/office/word/2010/wordprocessingInk" xmlns:wne="http://schemas.microsoft.com/office/word/2006/wordml" xmlns:wps="http://schemas.microsoft.com/office/word/2010/wordprocessingShape" mc:Ignorable="w14 w15 w16se w16cid w16 w16cex w16sdtdh w16sdtfl w16du wp14">
   <w:p>
     <w:pPr>
       <w:pStyle w:val="Encabezado"/>
@@ -61418,7 +61442,7 @@
 </file>
 
 <file path=word/header2.xml><?xml version="1.0" encoding="utf-8"?>
-<w:hdr xmlns:wpc="http://schemas.microsoft.com/office/word/2010/wordprocessingCanvas" xmlns:cx="http://schemas.microsoft.com/office/drawing/2014/chartex" xmlns:cx1="http://schemas.microsoft.com/office/drawing/2015/9/8/chartex" xmlns:cx2="http://schemas.microsoft.com/office/drawing/2015/10/21/chartex" xmlns:cx3="http://schemas.microsoft.com/office/drawing/2016/5/9/chartex" xmlns:cx4="http://schemas.microsoft.com/office/drawing/2016/5/10/chartex" xmlns:cx5="http://schemas.microsoft.com/office/drawing/2016/5/11/chartex" xmlns:cx6="http://schemas.microsoft.com/office/drawing/2016/5/12/chartex" xmlns:cx7="http://schemas.microsoft.com/office/drawing/2016/5/13/chartex" xmlns:cx8="http://schemas.microsoft.com/office/drawing/2016/5/14/chartex" xmlns:mc="http://schemas.openxmlformats.org/markup-compatibility/2006" xmlns:aink="http://schemas.microsoft.com/office/drawing/2016/ink" xmlns:am3d="http://schemas.microsoft.com/office/drawing/2017/model3d" xmlns:o="urn:schemas-microsoft-com:office:office" xmlns:oel="http://schemas.microsoft.com/office/2019/extlst" xmlns:r="http://schemas.openxmlformats.org/officeDocument/2006/relationships" xmlns:m="http://schemas.openxmlformats.org/officeDocument/2006/math" xmlns:v="urn:schemas-microsoft-com:vml" xmlns:wp14="http://schemas.microsoft.com/office/word/2010/wordprocessingDrawing" xmlns:wp="http://schemas.openxmlformats.org/drawingml/2006/wordprocessingDrawing" xmlns:w10="urn:schemas-microsoft-com:office:word" xmlns:w="http://schemas.openxmlformats.org/wordprocessingml/2006/main" xmlns:w14="http://schemas.microsoft.com/office/word/2010/wordml" xmlns:w15="http://schemas.microsoft.com/office/word/2012/wordml" xmlns:w16cex="http://schemas.microsoft.com/office/word/2018/wordml/cex" xmlns:w16cid="http://schemas.microsoft.com/office/word/2016/wordml/cid" xmlns:w16="http://schemas.microsoft.com/office/word/2018/wordml" xmlns:w16sdtdh="http://schemas.microsoft.com/office/word/2020/wordml/sdtdatahash" xmlns:w16se="http://schemas.microsoft.com/office/word/2015/wordml/symex" xmlns:wpg="http://schemas.microsoft.com/office/word/2010/wordprocessingGroup" xmlns:wpi="http://schemas.microsoft.com/office/word/2010/wordprocessingInk" xmlns:wne="http://schemas.microsoft.com/office/word/2006/wordml" xmlns:wps="http://schemas.microsoft.com/office/word/2010/wordprocessingShape" mc:Ignorable="w14 w15 w16se w16cid w16 w16cex w16sdtdh wp14">
+<w:hdr xmlns:wpc="http://schemas.microsoft.com/office/word/2010/wordprocessingCanvas" xmlns:cx="http://schemas.microsoft.com/office/drawing/2014/chartex" xmlns:cx1="http://schemas.microsoft.com/office/drawing/2015/9/8/chartex" xmlns:cx2="http://schemas.microsoft.com/office/drawing/2015/10/21/chartex" xmlns:cx3="http://schemas.microsoft.com/office/drawing/2016/5/9/chartex" xmlns:cx4="http://schemas.microsoft.com/office/drawing/2016/5/10/chartex" xmlns:cx5="http://schemas.microsoft.com/office/drawing/2016/5/11/chartex" xmlns:cx6="http://schemas.microsoft.com/office/drawing/2016/5/12/chartex" xmlns:cx7="http://schemas.microsoft.com/office/drawing/2016/5/13/chartex" xmlns:cx8="http://schemas.microsoft.com/office/drawing/2016/5/14/chartex" xmlns:mc="http://schemas.openxmlformats.org/markup-compatibility/2006" xmlns:aink="http://schemas.microsoft.com/office/drawing/2016/ink" xmlns:am3d="http://schemas.microsoft.com/office/drawing/2017/model3d" xmlns:o="urn:schemas-microsoft-com:office:office" xmlns:oel="http://schemas.microsoft.com/office/2019/extlst" xmlns:r="http://schemas.openxmlformats.org/officeDocument/2006/relationships" xmlns:m="http://schemas.openxmlformats.org/officeDocument/2006/math" xmlns:v="urn:schemas-microsoft-com:vml" xmlns:wp14="http://schemas.microsoft.com/office/word/2010/wordprocessingDrawing" xmlns:wp="http://schemas.openxmlformats.org/drawingml/2006/wordprocessingDrawing" xmlns:w10="urn:schemas-microsoft-com:office:word" xmlns:w="http://schemas.openxmlformats.org/wordprocessingml/2006/main" xmlns:w14="http://schemas.microsoft.com/office/word/2010/wordml" xmlns:w15="http://schemas.microsoft.com/office/word/2012/wordml" xmlns:w16cex="http://schemas.microsoft.com/office/word/2018/wordml/cex" xmlns:w16cid="http://schemas.microsoft.com/office/word/2016/wordml/cid" xmlns:w16="http://schemas.microsoft.com/office/word/2018/wordml" xmlns:w16du="http://schemas.microsoft.com/office/word/2023/wordml/word16du" xmlns:w16sdtdh="http://schemas.microsoft.com/office/word/2020/wordml/sdtdatahash" xmlns:w16sdtfl="http://schemas.microsoft.com/office/word/2024/wordml/sdtformatlock" xmlns:w16se="http://schemas.microsoft.com/office/word/2015/wordml/symex" xmlns:wpg="http://schemas.microsoft.com/office/word/2010/wordprocessingGroup" xmlns:wpi="http://schemas.microsoft.com/office/word/2010/wordprocessingInk" xmlns:wne="http://schemas.microsoft.com/office/word/2006/wordml" xmlns:wps="http://schemas.microsoft.com/office/word/2010/wordprocessingShape" mc:Ignorable="w14 w15 w16se w16cid w16 w16cex w16sdtdh w16sdtfl w16du wp14">
   <w:p>
     <w:pPr>
       <w:pStyle w:val="Encabezado"/>
@@ -61492,7 +61516,7 @@
 </file>
 
 <file path=word/numbering.xml><?xml version="1.0" encoding="utf-8"?>
-<w:numbering xmlns:wpc="http://schemas.microsoft.com/office/word/2010/wordprocessingCanvas" xmlns:cx="http://schemas.microsoft.com/office/drawing/2014/chartex" xmlns:cx1="http://schemas.microsoft.com/office/drawing/2015/9/8/chartex" xmlns:cx2="http://schemas.microsoft.com/office/drawing/2015/10/21/chartex" xmlns:cx3="http://schemas.microsoft.com/office/drawing/2016/5/9/chartex" xmlns:cx4="http://schemas.microsoft.com/office/drawing/2016/5/10/chartex" xmlns:cx5="http://schemas.microsoft.com/office/drawing/2016/5/11/chartex" xmlns:cx6="http://schemas.microsoft.com/office/drawing/2016/5/12/chartex" xmlns:cx7="http://schemas.microsoft.com/office/drawing/2016/5/13/chartex" xmlns:cx8="http://schemas.microsoft.com/office/drawing/2016/5/14/chartex" xmlns:mc="http://schemas.openxmlformats.org/markup-compatibility/2006" xmlns:aink="http://schemas.microsoft.com/office/drawing/2016/ink" xmlns:am3d="http://schemas.microsoft.com/office/drawing/2017/model3d" xmlns:o="urn:schemas-microsoft-com:office:office" xmlns:oel="http://schemas.microsoft.com/office/2019/extlst" xmlns:r="http://schemas.openxmlformats.org/officeDocument/2006/relationships" xmlns:m="http://schemas.openxmlformats.org/officeDocument/2006/math" xmlns:v="urn:schemas-microsoft-com:vml" xmlns:wp14="http://schemas.microsoft.com/office/word/2010/wordprocessingDrawing" xmlns:wp="http://schemas.openxmlformats.org/drawingml/2006/wordprocessingDrawing" xmlns:w10="urn:schemas-microsoft-com:office:word" xmlns:w="http://schemas.openxmlformats.org/wordprocessingml/2006/main" xmlns:w14="http://schemas.microsoft.com/office/word/2010/wordml" xmlns:w15="http://schemas.microsoft.com/office/word/2012/wordml" xmlns:w16cex="http://schemas.microsoft.com/office/word/2018/wordml/cex" xmlns:w16cid="http://schemas.microsoft.com/office/word/2016/wordml/cid" xmlns:w16="http://schemas.microsoft.com/office/word/2018/wordml" xmlns:w16sdtdh="http://schemas.microsoft.com/office/word/2020/wordml/sdtdatahash" xmlns:w16se="http://schemas.microsoft.com/office/word/2015/wordml/symex" xmlns:wpg="http://schemas.microsoft.com/office/word/2010/wordprocessingGroup" xmlns:wpi="http://schemas.microsoft.com/office/word/2010/wordprocessingInk" xmlns:wne="http://schemas.microsoft.com/office/word/2006/wordml" xmlns:wps="http://schemas.microsoft.com/office/word/2010/wordprocessingShape" mc:Ignorable="w14 w15 w16se w16cid w16 w16cex w16sdtdh wp14">
+<w:numbering xmlns:wpc="http://schemas.microsoft.com/office/word/2010/wordprocessingCanvas" xmlns:cx="http://schemas.microsoft.com/office/drawing/2014/chartex" xmlns:cx1="http://schemas.microsoft.com/office/drawing/2015/9/8/chartex" xmlns:cx2="http://schemas.microsoft.com/office/drawing/2015/10/21/chartex" xmlns:cx3="http://schemas.microsoft.com/office/drawing/2016/5/9/chartex" xmlns:cx4="http://schemas.microsoft.com/office/drawing/2016/5/10/chartex" xmlns:cx5="http://schemas.microsoft.com/office/drawing/2016/5/11/chartex" xmlns:cx6="http://schemas.microsoft.com/office/drawing/2016/5/12/chartex" xmlns:cx7="http://schemas.microsoft.com/office/drawing/2016/5/13/chartex" xmlns:cx8="http://schemas.microsoft.com/office/drawing/2016/5/14/chartex" xmlns:mc="http://schemas.openxmlformats.org/markup-compatibility/2006" xmlns:aink="http://schemas.microsoft.com/office/drawing/2016/ink" xmlns:am3d="http://schemas.microsoft.com/office/drawing/2017/model3d" xmlns:o="urn:schemas-microsoft-com:office:office" xmlns:oel="http://schemas.microsoft.com/office/2019/extlst" xmlns:r="http://schemas.openxmlformats.org/officeDocument/2006/relationships" xmlns:m="http://schemas.openxmlformats.org/officeDocument/2006/math" xmlns:v="urn:schemas-microsoft-com:vml" xmlns:wp14="http://schemas.microsoft.com/office/word/2010/wordprocessingDrawing" xmlns:wp="http://schemas.openxmlformats.org/drawingml/2006/wordprocessingDrawing" xmlns:w10="urn:schemas-microsoft-com:office:word" xmlns:w="http://schemas.openxmlformats.org/wordprocessingml/2006/main" xmlns:w14="http://schemas.microsoft.com/office/word/2010/wordml" xmlns:w15="http://schemas.microsoft.com/office/word/2012/wordml" xmlns:w16cex="http://schemas.microsoft.com/office/word/2018/wordml/cex" xmlns:w16cid="http://schemas.microsoft.com/office/word/2016/wordml/cid" xmlns:w16="http://schemas.microsoft.com/office/word/2018/wordml" xmlns:w16du="http://schemas.microsoft.com/office/word/2023/wordml/word16du" xmlns:w16sdtdh="http://schemas.microsoft.com/office/word/2020/wordml/sdtdatahash" xmlns:w16sdtfl="http://schemas.microsoft.com/office/word/2024/wordml/sdtformatlock" xmlns:w16se="http://schemas.microsoft.com/office/word/2015/wordml/symex" xmlns:wpg="http://schemas.microsoft.com/office/word/2010/wordprocessingGroup" xmlns:wpi="http://schemas.microsoft.com/office/word/2010/wordprocessingInk" xmlns:wne="http://schemas.microsoft.com/office/word/2006/wordml" xmlns:wps="http://schemas.microsoft.com/office/word/2010/wordprocessingShape" mc:Ignorable="w14 w15 w16se w16cid w16 w16cex w16sdtdh w16sdtfl w16du wp14">
   <w:abstractNum w:abstractNumId="0" w15:restartNumberingAfterBreak="0">
     <w:nsid w:val="00000001"/>
     <w:multiLevelType w:val="multilevel"/>
@@ -63432,7 +63456,7 @@
 </file>
 
 <file path=word/styles.xml><?xml version="1.0" encoding="utf-8"?>
-<w:styles xmlns:mc="http://schemas.openxmlformats.org/markup-compatibility/2006" xmlns:r="http://schemas.openxmlformats.org/officeDocument/2006/relationships" xmlns:w="http://schemas.openxmlformats.org/wordprocessingml/2006/main" xmlns:w14="http://schemas.microsoft.com/office/word/2010/wordml" xmlns:w15="http://schemas.microsoft.com/office/word/2012/wordml" xmlns:w16cex="http://schemas.microsoft.com/office/word/2018/wordml/cex" xmlns:w16cid="http://schemas.microsoft.com/office/word/2016/wordml/cid" xmlns:w16="http://schemas.microsoft.com/office/word/2018/wordml" xmlns:w16sdtdh="http://schemas.microsoft.com/office/word/2020/wordml/sdtdatahash" xmlns:w16se="http://schemas.microsoft.com/office/word/2015/wordml/symex" mc:Ignorable="w14 w15 w16se w16cid w16 w16cex w16sdtdh">
+<w:styles xmlns:mc="http://schemas.openxmlformats.org/markup-compatibility/2006" xmlns:r="http://schemas.openxmlformats.org/officeDocument/2006/relationships" xmlns:w="http://schemas.openxmlformats.org/wordprocessingml/2006/main" xmlns:w14="http://schemas.microsoft.com/office/word/2010/wordml" xmlns:w15="http://schemas.microsoft.com/office/word/2012/wordml" xmlns:w16cex="http://schemas.microsoft.com/office/word/2018/wordml/cex" xmlns:w16cid="http://schemas.microsoft.com/office/word/2016/wordml/cid" xmlns:w16="http://schemas.microsoft.com/office/word/2018/wordml" xmlns:w16du="http://schemas.microsoft.com/office/word/2023/wordml/word16du" xmlns:w16sdtdh="http://schemas.microsoft.com/office/word/2020/wordml/sdtdatahash" xmlns:w16sdtfl="http://schemas.microsoft.com/office/word/2024/wordml/sdtformatlock" xmlns:w16se="http://schemas.microsoft.com/office/word/2015/wordml/symex" mc:Ignorable="w14 w15 w16se w16cid w16 w16cex w16sdtdh w16sdtfl w16du">
   <w:docDefaults>
     <w:rPrDefault>
       <w:rPr>
@@ -65018,6 +65042,10 @@
 </file>
 
 <file path=customXml/item1.xml><?xml version="1.0" encoding="utf-8"?>
+<b:Sources xmlns:b="http://schemas.openxmlformats.org/officeDocument/2006/bibliography" xmlns="http://schemas.openxmlformats.org/officeDocument/2006/bibliography" SelectedStyle="\APA.XSL" StyleName="APA"/>
+</file>
+
+<file path=customXml/item2.xml><?xml version="1.0" encoding="utf-8"?>
 <s:customData xmlns="http://www.wps.cn/officeDocument/2013/wpsCustomData" xmlns:s="http://www.wps.cn/officeDocument/2013/wpsCustomData">
   <customSectProps>
     <customSectPr/>
@@ -65027,22 +65055,18 @@
 </s:customData>
 </file>
 
-<file path=customXml/item2.xml><?xml version="1.0" encoding="utf-8"?>
-<b:Sources xmlns:b="http://schemas.openxmlformats.org/officeDocument/2006/bibliography" xmlns="http://schemas.openxmlformats.org/officeDocument/2006/bibliography" SelectedStyle="\APA.XSL" StyleName="APA"/>
+<file path=customXml/itemProps1.xml><?xml version="1.0" encoding="utf-8"?>
+<ds:datastoreItem xmlns:ds="http://schemas.openxmlformats.org/officeDocument/2006/customXml" ds:itemID="{FB80DA95-0F61-4087-9B4A-3A18D254964B}">
+  <ds:schemaRefs>
+    <ds:schemaRef ds:uri="http://schemas.openxmlformats.org/officeDocument/2006/bibliography"/>
+  </ds:schemaRefs>
+</ds:datastoreItem>
 </file>
 
-<file path=customXml/itemProps1.xml><?xml version="1.0" encoding="utf-8"?>
+<file path=customXml/itemProps2.xml><?xml version="1.0" encoding="utf-8"?>
 <ds:datastoreItem xmlns:ds="http://schemas.openxmlformats.org/officeDocument/2006/customXml" ds:itemID="{B1977F7D-205B-4081-913C-38D41E755F92}">
   <ds:schemaRefs>
     <ds:schemaRef ds:uri="http://www.wps.cn/officeDocument/2013/wpsCustomData"/>
   </ds:schemaRefs>
 </ds:datastoreItem>
-</file>
-
-<file path=customXml/itemProps2.xml><?xml version="1.0" encoding="utf-8"?>
-<ds:datastoreItem xmlns:ds="http://schemas.openxmlformats.org/officeDocument/2006/customXml" ds:itemID="{FB80DA95-0F61-4087-9B4A-3A18D254964B}">
-  <ds:schemaRefs>
-    <ds:schemaRef ds:uri="http://schemas.openxmlformats.org/officeDocument/2006/bibliography"/>
-  </ds:schemaRefs>
-</ds:datastoreItem>
 </file>
</xml_diff>